<commit_message>
LA MARQUE 1부 15화: rename trademark attorney and soap maker to avoid clashes with later characters
Co-Authored-By: Claude Opus 5.5 <noreply@anthropic.com>
Claude-Session: https://claude.ai/code/session_01N4vhCLeYxrjvGnDxQBD9Cq
</commit_message>
<xml_diff>
--- a/la-marque/대본/1부/15화_Le_nom.docx
+++ b/la-marque/대본/1부/15화_Le_nom.docx
@@ -62,7 +62,7 @@
         <w:t xml:space="preserve"> </w:t>
       </w:r>
       <w:r>
-        <w:t xml:space="preserve">- 등장인물: Clémence, Bastien, Inès, Me Rachid Benali(변리사, conseil en propriété industrielle), Liane Ferrand(보르도 근처 비누 공방 「Liane」 대표, 전화), Seo Ji-hoon(화상), Gérard</w:t>
+        <w:t xml:space="preserve">- 등장인물: Clémence, Bastien, Inès, Me Rachid Lemaire(변리사, conseil en propriété industrielle), Liane Castagné(보르도 근처 비누 공방 「Liane」 대표, 전화), Seo Ji-hoon(화상), Gérard</w:t>
       </w:r>
       <w:r>
         <w:t xml:space="preserve"> </w:t>
@@ -302,7 +302,7 @@
         <w:pStyle w:val="BodyText"/>
       </w:pPr>
       <w:r>
-        <w:t xml:space="preserve">CLEMENCE: J’ai un mail du conseil en propriété industrielle. Maître Benali. Il a fait la recherche sur le nom.</w:t>
+        <w:t xml:space="preserve">CLEMENCE: J’ai un mail du conseil en propriété industrielle. Maître Lemaire. Il a fait la recherche sur le nom.</w:t>
       </w:r>
     </w:p>
     <w:p>
@@ -358,7 +358,7 @@
         <w:pStyle w:val="BodyText"/>
       </w:pPr>
       <w:r>
-        <w:t xml:space="preserve">CLEMENCE: Benali nous reçoit à onze heures. Il dit : « Ne tombez pas amoureux du nom avant. »</w:t>
+        <w:t xml:space="preserve">CLEMENCE: Lemaire nous reçoit à onze heures. Il dit : « Ne tombez pas amoureux du nom avant. »</w:t>
       </w:r>
     </w:p>
     <w:p>
@@ -382,7 +382,7 @@
         <w:pStyle w:val="BodyText"/>
       </w:pPr>
       <w:r>
-        <w:t xml:space="preserve">CLEMENCE: Et après Benali, Bastien, tu nous fais ton tableau. Celui que tu prépares depuis l’avion.</w:t>
+        <w:t xml:space="preserve">CLEMENCE: Et après Lemaire, Bastien, tu nous fais ton tableau. Celui que tu prépares depuis l’avion.</w:t>
       </w:r>
     </w:p>
     <w:p>
@@ -416,7 +416,7 @@
         <w:pStyle w:val="FirstParagraph"/>
       </w:pPr>
       <w:r>
-        <w:t xml:space="preserve">BENALI: Asseyez-vous. Je vais commencer par une leçon rapide sur les classes de marques. Ensuite, la mauvaise nouvelle.</w:t>
+        <w:t xml:space="preserve">LEMAIRE: Asseyez-vous. Je vais commencer par une leçon rapide sur les classes de marques. Ensuite, la mauvaise nouvelle.</w:t>
       </w:r>
     </w:p>
     <w:p>
@@ -432,7 +432,7 @@
         <w:pStyle w:val="BodyText"/>
       </w:pPr>
       <w:r>
-        <w:t xml:space="preserve">BENALI: Une marque est protégée pour des produits précis, rangés en classes. Votre voisine de Bordeaux est en classe trois : les cosmétiques. Vous, vous devez déposer en classe dix, les dispositifs médicaux, et probablement en classe cinq.</w:t>
+        <w:t xml:space="preserve">LEMAIRE: Une marque est protégée pour des produits précis, rangés en classes. Votre voisine de Bordeaux est en classe trois : les cosmétiques. Vous, vous devez déposer en classe dix, les dispositifs médicaux, et probablement en classe cinq.</w:t>
       </w:r>
     </w:p>
     <w:p>
@@ -448,7 +448,7 @@
         <w:pStyle w:val="BodyText"/>
       </w:pPr>
       <w:r>
-        <w:t xml:space="preserve">BENALI: C’est une demi-nouvelle. Les classes ne suffisent pas. Le juge regarde aussi si le public peut confondre.</w:t>
+        <w:t xml:space="preserve">LEMAIRE: C’est une demi-nouvelle. Les classes ne suffisent pas. Le juge regarde aussi si le public peut confondre.</w:t>
       </w:r>
     </w:p>
     <w:p>
@@ -464,7 +464,7 @@
         <w:pStyle w:val="BodyText"/>
       </w:pPr>
       <w:r>
-        <w:t xml:space="preserve">BENALI: Les médecins, oui. Mais les patientes achètent des crèmes. Et elles entendent parler de votre gel. La propriétaire de la marque pourrait s’opposer à votre dépôt. Ou vous attaquer plus tard, quand vous serez connus.</w:t>
+        <w:t xml:space="preserve">LEMAIRE: Les médecins, oui. Mais les patientes achètent des crèmes. Et elles entendent parler de votre gel. La propriétaire de la marque pourrait s’opposer à votre dépôt. Ou vous attaquer plus tard, quand vous serez connus.</w:t>
       </w:r>
     </w:p>
     <w:p>
@@ -480,7 +480,7 @@
         <w:pStyle w:val="BodyText"/>
       </w:pPr>
       <w:r>
-        <w:t xml:space="preserve">BENALI: Exactement. Voilà pourquoi on règle ça maintenant, quand c’est encore petit.</w:t>
+        <w:t xml:space="preserve">LEMAIRE: Exactement. Voilà pourquoi on règle ça maintenant, quand c’est encore petit.</w:t>
       </w:r>
     </w:p>
     <w:p>
@@ -496,7 +496,7 @@
         <w:pStyle w:val="BodyText"/>
       </w:pPr>
       <w:r>
-        <w:t xml:space="preserve">BENALI: Trois. Un : changer de nom. Simple, pas cher, mais douloureux, je le vois à vos visages.</w:t>
+        <w:t xml:space="preserve">LEMAIRE: Trois. Un : changer de nom. Simple, pas cher, mais douloureux, je le vois à vos visages.</w:t>
       </w:r>
     </w:p>
     <w:p>
@@ -512,7 +512,7 @@
         <w:pStyle w:val="BodyText"/>
       </w:pPr>
       <w:r>
-        <w:t xml:space="preserve">BENALI: Deux : racheter sa marque. Possible, mais ça peut coûter cher si elle comprend votre projet.</w:t>
+        <w:t xml:space="preserve">LEMAIRE: Deux : racheter sa marque. Possible, mais ça peut coûter cher si elle comprend votre projet.</w:t>
       </w:r>
     </w:p>
     <w:p>
@@ -528,7 +528,7 @@
         <w:pStyle w:val="BodyText"/>
       </w:pPr>
       <w:r>
-        <w:t xml:space="preserve">BENALI: Trois : un accord de coexistence. Elle garde les cosmétiques, vous gardez les dispositifs médicaux. Chacun promet de ne jamais entrer dans le domaine de l’autre. C’est un contrat simple, et il protège les deux côtés, pour toujours.</w:t>
+        <w:t xml:space="preserve">LEMAIRE: Trois : un accord de coexistence. Elle garde les cosmétiques, vous gardez les dispositifs médicaux. Chacun promet de ne jamais entrer dans le domaine de l’autre. C’est un contrat simple, et il protège les deux côtés, pour toujours.</w:t>
       </w:r>
     </w:p>
     <w:p>
@@ -544,7 +544,7 @@
         <w:pStyle w:val="BodyText"/>
       </w:pPr>
       <w:r>
-        <w:t xml:space="preserve">BENALI: Parce que ça la protège aussi. Si vous devenez grands, personne ne pourra l’attaquer, elle.</w:t>
+        <w:t xml:space="preserve">LEMAIRE: Parce que ça la protège aussi. Si vous devenez grands, personne ne pourra l’attaquer, elle.</w:t>
       </w:r>
     </w:p>
     <w:p>
@@ -560,7 +560,7 @@
         <w:pStyle w:val="BodyText"/>
       </w:pPr>
       <w:r>
-        <w:t xml:space="preserve">BENALI: Madame Liane Ferrand. La marque porte son prénom.</w:t>
+        <w:t xml:space="preserve">LEMAIRE: Madame Liane Castagné. La marque porte son prénom.</w:t>
       </w:r>
     </w:p>
     <w:p>
@@ -584,7 +584,7 @@
         <w:pStyle w:val="BodyText"/>
       </w:pPr>
       <w:r>
-        <w:t xml:space="preserve">BENALI: C’est inhabituel. Mais souvent efficace. Ne promettez rien d’écrit au téléphone.</w:t>
+        <w:t xml:space="preserve">LEMAIRE: C’est inhabituel. Mais souvent efficace. Ne promettez rien d’écrit au téléphone.</w:t>
       </w:r>
     </w:p>
     <w:p>
@@ -600,23 +600,23 @@
         <w:pStyle w:val="BodyText"/>
       </w:pPr>
       <w:r>
-        <w:t xml:space="preserve">FERRAND: Allô ? Savonnerie Liane, j’écoute.</w:t>
-      </w:r>
-    </w:p>
-    <w:p>
-      <w:pPr>
-        <w:pStyle w:val="BodyText"/>
-      </w:pPr>
-      <w:r>
-        <w:t xml:space="preserve">CLEMENCE: Bonjour, madame Ferrand. Je m’appelle Clémence Arnaud. Je crée une entreprise qui s’appelle aussi Liane. Je voulais vous le dire moi-même. Nous démarrons à peine, et je préfère commencer honnêtement.</w:t>
-      </w:r>
-    </w:p>
-    <w:p>
-      <w:pPr>
-        <w:pStyle w:val="BodyText"/>
-      </w:pPr>
-      <w:r>
-        <w:t xml:space="preserve">FERRAND: Aussi Liane ? Vous faites du savon ?</w:t>
+        <w:t xml:space="preserve">CASTAGNE: Allô ? Savonnerie Liane, j’écoute.</w:t>
+      </w:r>
+    </w:p>
+    <w:p>
+      <w:pPr>
+        <w:pStyle w:val="BodyText"/>
+      </w:pPr>
+      <w:r>
+        <w:t xml:space="preserve">CLEMENCE: Bonjour, madame Castagné. Je m’appelle Clémence Arnaud. Je crée une entreprise qui s’appelle aussi Liane. Je voulais vous le dire moi-même. Nous démarrons à peine, et je préfère commencer honnêtement.</w:t>
+      </w:r>
+    </w:p>
+    <w:p>
+      <w:pPr>
+        <w:pStyle w:val="BodyText"/>
+      </w:pPr>
+      <w:r>
+        <w:t xml:space="preserve">CASTAGNE: Aussi Liane ? Vous faites du savon ?</w:t>
       </w:r>
     </w:p>
     <w:p>
@@ -632,7 +632,7 @@
         <w:pStyle w:val="BodyText"/>
       </w:pPr>
       <w:r>
-        <w:t xml:space="preserve">FERRAND: C’est gentil. Les gens ne téléphonent plus, aujourd’hui. Ils envoient des avocats.</w:t>
+        <w:t xml:space="preserve">CASTAGNE: C’est gentil. Les gens ne téléphonent plus, aujourd’hui. Ils envoient des avocats.</w:t>
       </w:r>
     </w:p>
     <w:p>
@@ -648,7 +648,7 @@
         <w:pStyle w:val="BodyText"/>
       </w:pPr>
       <w:r>
-        <w:t xml:space="preserve">FERRAND: Chacun chez soi. J’aime bien. Mon mari disait ça tout le temps. Il a choisi le nom de la savonnerie il y a trente ans, quand on a ouvert la boutique au marché.</w:t>
+        <w:t xml:space="preserve">CASTAGNE: Chacun chez soi. J’aime bien. Mon mari disait ça tout le temps. Il a choisi le nom de la savonnerie il y a trente ans, quand on a ouvert la boutique au marché.</w:t>
       </w:r>
     </w:p>
     <w:p>
@@ -664,7 +664,7 @@
         <w:pStyle w:val="BodyText"/>
       </w:pPr>
       <w:r>
-        <w:t xml:space="preserve">FERRAND: Romantique et économique. Il n’a pas payé de graphiste. J’accepte, mademoiselle. À une condition.</w:t>
+        <w:t xml:space="preserve">CASTAGNE: Romantique et économique. Il n’a pas payé de graphiste. J’accepte, mademoiselle. À une condition.</w:t>
       </w:r>
     </w:p>
     <w:p>
@@ -680,15 +680,15 @@
         <w:pStyle w:val="BodyText"/>
       </w:pPr>
       <w:r>
-        <w:t xml:space="preserve">FERRAND: Vous ne vendrez jamais de savon. Et vous m’envoyez une boîte de votre gel. Vide. Pour ma vitrine.</w:t>
-      </w:r>
-    </w:p>
-    <w:p>
-      <w:pPr>
-        <w:pStyle w:val="BodyText"/>
-      </w:pPr>
-      <w:r>
-        <w:t xml:space="preserve">CLEMENCE: Une boîte vide, dans une vitrine de savons. Marché conclu, madame Ferrand.</w:t>
+        <w:t xml:space="preserve">CASTAGNE: Vous ne vendrez jamais de savon. Et vous m’envoyez une boîte de votre gel. Vide. Pour ma vitrine.</w:t>
+      </w:r>
+    </w:p>
+    <w:p>
+      <w:pPr>
+        <w:pStyle w:val="BodyText"/>
+      </w:pPr>
+      <w:r>
+        <w:t xml:space="preserve">CLEMENCE: Une boîte vide, dans une vitrine de savons. Marché conclu, madame Castagné.</w:t>
       </w:r>
     </w:p>
     <w:bookmarkEnd w:id="22"/>
@@ -2000,7 +2000,7 @@
         <w:t xml:space="preserve"> </w:t>
       </w:r>
       <w:r>
-        <w:t xml:space="preserve">1. Mme Liane Ferrand (Savonnerie Liane) conserve l’usage exclusif de la marque pour les produits cosmétiques (classe 3).</w:t>
+        <w:t xml:space="preserve">1. Mme Liane Castagné (Savonnerie Liane) conserve l’usage exclusif de la marque pour les produits cosmétiques (classe 3).</w:t>
       </w:r>
       <w:r>
         <w:t xml:space="preserve"> </w:t>
@@ -2830,7 +2830,7 @@
         <w:pStyle w:val="BodyText"/>
       </w:pPr>
       <w:r>
-        <w:t xml:space="preserve">클레망스: 변리사한테서 메일 왔어. 베날리 변리사. 이름 조사를 해 줬어.</w:t>
+        <w:t xml:space="preserve">클레망스: 변리사한테서 메일 왔어. 르메르 변리사. 이름 조사를 해 줬어.</w:t>
       </w:r>
     </w:p>
     <w:p>
@@ -2886,7 +2886,7 @@
         <w:pStyle w:val="BodyText"/>
       </w:pPr>
       <w:r>
-        <w:t xml:space="preserve">클레망스: 베날리 변리사가 11시에 만나 준대. 「그 전에 이름과 사랑에 빠지지 마세요.」래.</w:t>
+        <w:t xml:space="preserve">클레망스: 르메르 변리사가 11시에 만나 준대. 「그 전에 이름과 사랑에 빠지지 마세요.」래.</w:t>
       </w:r>
     </w:p>
     <w:p>
@@ -2944,7 +2944,7 @@
         <w:pStyle w:val="FirstParagraph"/>
       </w:pPr>
       <w:r>
-        <w:t xml:space="preserve">베날리: 앉으세요. 상표 분류에 대한 짧은 강의부터 하죠. 그다음에 나쁜 소식이요.</w:t>
+        <w:t xml:space="preserve">르메르: 앉으세요. 상표 분류에 대한 짧은 강의부터 하죠. 그다음에 나쁜 소식이요.</w:t>
       </w:r>
     </w:p>
     <w:p>
@@ -2960,7 +2960,7 @@
         <w:pStyle w:val="BodyText"/>
       </w:pPr>
       <w:r>
-        <w:t xml:space="preserve">베날리: 상표는 특정 상품에 대해 보호되고, 상품은 류(類)로 분류됩니다. 보르도의 이웃은 3류, 화장품이에요. 여러분은 10류, 의료기기로 출원해야 하고, 아마 5류도 필요할 겁니다.</w:t>
+        <w:t xml:space="preserve">르메르: 상표는 특정 상품에 대해 보호되고, 상품은 류(類)로 분류됩니다. 보르도의 이웃은 3류, 화장품이에요. 여러분은 10류, 의료기기로 출원해야 하고, 아마 5류도 필요할 겁니다.</w:t>
       </w:r>
     </w:p>
     <w:p>
@@ -2976,7 +2976,7 @@
         <w:pStyle w:val="BodyText"/>
       </w:pPr>
       <w:r>
-        <w:t xml:space="preserve">베날리: 반쪽짜리 소식이에요. 류만으로는 부족해요. 판사는 대중이 혼동할 수 있는지도 봐요.</w:t>
+        <w:t xml:space="preserve">르메르: 반쪽짜리 소식이에요. 류만으로는 부족해요. 판사는 대중이 혼동할 수 있는지도 봐요.</w:t>
       </w:r>
     </w:p>
     <w:p>
@@ -2992,7 +2992,7 @@
         <w:pStyle w:val="BodyText"/>
       </w:pPr>
       <w:r>
-        <w:t xml:space="preserve">베날리: 의사는 그렇죠. 하지만 환자들은 크림을 사요. 그리고 여러분의 젤 얘기를 듣게 되죠. 상표권자가 여러분의 출원에 이의를 제기할 수도 있어요. 아니면 나중에, 여러분이 유명해졌을 때 소송을 걸 수도 있고요.</w:t>
+        <w:t xml:space="preserve">르메르: 의사는 그렇죠. 하지만 환자들은 크림을 사요. 그리고 여러분의 젤 얘기를 듣게 되죠. 상표권자가 여러분의 출원에 이의를 제기할 수도 있어요. 아니면 나중에, 여러분이 유명해졌을 때 소송을 걸 수도 있고요.</w:t>
       </w:r>
     </w:p>
     <w:p>
@@ -3008,7 +3008,7 @@
         <w:pStyle w:val="BodyText"/>
       </w:pPr>
       <w:r>
-        <w:t xml:space="preserve">베날리: 바로 그거예요. 그래서 아직 작을 때 지금 정리하는 겁니다.</w:t>
+        <w:t xml:space="preserve">르메르: 바로 그거예요. 그래서 아직 작을 때 지금 정리하는 겁니다.</w:t>
       </w:r>
     </w:p>
     <w:p>
@@ -3024,7 +3024,7 @@
         <w:pStyle w:val="BodyText"/>
       </w:pPr>
       <w:r>
-        <w:t xml:space="preserve">베날리: 세 가지. 하나, 이름을 바꾼다. 간단하고 싸지만 고통스럽죠. 얼굴에 다 보이네요.</w:t>
+        <w:t xml:space="preserve">르메르: 세 가지. 하나, 이름을 바꾼다. 간단하고 싸지만 고통스럽죠. 얼굴에 다 보이네요.</w:t>
       </w:r>
     </w:p>
     <w:p>
@@ -3040,7 +3040,7 @@
         <w:pStyle w:val="BodyText"/>
       </w:pPr>
       <w:r>
-        <w:t xml:space="preserve">베날리: 둘, 상표를 사들인다. 가능하지만, 상대가 여러분 사업을 이해하면 비쌀 수 있어요.</w:t>
+        <w:t xml:space="preserve">르메르: 둘, 상표를 사들인다. 가능하지만, 상대가 여러분 사업을 이해하면 비쌀 수 있어요.</w:t>
       </w:r>
     </w:p>
     <w:p>
@@ -3056,7 +3056,7 @@
         <w:pStyle w:val="BodyText"/>
       </w:pPr>
       <w:r>
-        <w:t xml:space="preserve">베날리: 셋, 공존 합의. 상대는 화장품을, 여러분은 의료기기를 가져요. 서로 상대 분야에 절대 들어가지 않기로 약속하는 거죠. 간단한 계약이고, 양쪽을 영원히 보호해요.</w:t>
+        <w:t xml:space="preserve">르메르: 셋, 공존 합의. 상대는 화장품을, 여러분은 의료기기를 가져요. 서로 상대 분야에 절대 들어가지 않기로 약속하는 거죠. 간단한 계약이고, 양쪽을 영원히 보호해요.</w:t>
       </w:r>
     </w:p>
     <w:p>
@@ -3072,7 +3072,7 @@
         <w:pStyle w:val="BodyText"/>
       </w:pPr>
       <w:r>
-        <w:t xml:space="preserve">베날리: 그분도 보호받으니까요. 여러분이 커지면 아무도 그분을 공격할 수 없게 돼요.</w:t>
+        <w:t xml:space="preserve">르메르: 그분도 보호받으니까요. 여러분이 커지면 아무도 그분을 공격할 수 없게 돼요.</w:t>
       </w:r>
     </w:p>
     <w:p>
@@ -3088,7 +3088,7 @@
         <w:pStyle w:val="BodyText"/>
       </w:pPr>
       <w:r>
-        <w:t xml:space="preserve">베날리: 리안 페랑 부인이요. 상표가 그분 이름이에요.</w:t>
+        <w:t xml:space="preserve">르메르: 리안 카스타녜 부인이요. 상표가 그분 이름이에요.</w:t>
       </w:r>
     </w:p>
     <w:p>
@@ -3112,7 +3112,7 @@
         <w:pStyle w:val="BodyText"/>
       </w:pPr>
       <w:r>
-        <w:t xml:space="preserve">베날리: 흔한 일은 아니지만, 효과적인 경우가 많아요. 전화로 문서상 약속은 하지 마세요.</w:t>
+        <w:t xml:space="preserve">르메르: 흔한 일은 아니지만, 효과적인 경우가 많아요. 전화로 문서상 약속은 하지 마세요.</w:t>
       </w:r>
     </w:p>
     <w:p>
@@ -3128,23 +3128,23 @@
         <w:pStyle w:val="BodyText"/>
       </w:pPr>
       <w:r>
-        <w:t xml:space="preserve">페랑: 여보세요? 리안 비누 공방입니다.</w:t>
-      </w:r>
-    </w:p>
-    <w:p>
-      <w:pPr>
-        <w:pStyle w:val="BodyText"/>
-      </w:pPr>
-      <w:r>
-        <w:t xml:space="preserve">클레망스: 안녕하세요, 페랑 부인. 클레망스 아르노라고 합니다. 저도 리안이라는 회사를 만들고 있어요. 직접 말씀드리고 싶었어요. 이제 막 시작하는 회사라, 정직하게 시작하고 싶어서요.</w:t>
-      </w:r>
-    </w:p>
-    <w:p>
-      <w:pPr>
-        <w:pStyle w:val="BodyText"/>
-      </w:pPr>
-      <w:r>
-        <w:t xml:space="preserve">페랑: 그쪽도 리안이요? 비누 만들어요?</w:t>
+        <w:t xml:space="preserve">카스타녜: 여보세요? 리안 비누 공방입니다.</w:t>
+      </w:r>
+    </w:p>
+    <w:p>
+      <w:pPr>
+        <w:pStyle w:val="BodyText"/>
+      </w:pPr>
+      <w:r>
+        <w:t xml:space="preserve">클레망스: 안녕하세요, 카스타녜 부인. 클레망스 아르노라고 합니다. 저도 리안이라는 회사를 만들고 있어요. 직접 말씀드리고 싶었어요. 이제 막 시작하는 회사라, 정직하게 시작하고 싶어서요.</w:t>
+      </w:r>
+    </w:p>
+    <w:p>
+      <w:pPr>
+        <w:pStyle w:val="BodyText"/>
+      </w:pPr>
+      <w:r>
+        <w:t xml:space="preserve">카스타녜: 그쪽도 리안이요? 비누 만들어요?</w:t>
       </w:r>
     </w:p>
     <w:p>
@@ -3160,7 +3160,7 @@
         <w:pStyle w:val="BodyText"/>
       </w:pPr>
       <w:r>
-        <w:t xml:space="preserve">페랑: 친절하네요. 요즘 사람들은 전화를 안 해요. 변호사를 보내죠.</w:t>
+        <w:t xml:space="preserve">카스타녜: 친절하네요. 요즘 사람들은 전화를 안 해요. 변호사를 보내죠.</w:t>
       </w:r>
     </w:p>
     <w:p>
@@ -3176,7 +3176,7 @@
         <w:pStyle w:val="BodyText"/>
       </w:pPr>
       <w:r>
-        <w:t xml:space="preserve">페랑: 각자 자기 자리에서. 좋네요. 남편이 늘 하던 말이에요. 30년 전 시장에 가게를 열 때 남편이 공방 이름을 지었어요.</w:t>
+        <w:t xml:space="preserve">카스타녜: 각자 자기 자리에서. 좋네요. 남편이 늘 하던 말이에요. 30년 전 시장에 가게를 열 때 남편이 공방 이름을 지었어요.</w:t>
       </w:r>
     </w:p>
     <w:p>
@@ -3192,7 +3192,7 @@
         <w:pStyle w:val="BodyText"/>
       </w:pPr>
       <w:r>
-        <w:t xml:space="preserve">페랑: 낭만적이고 경제적이었죠. 디자이너한테 돈을 안 냈으니까. 받아들일게요, 아가씨. 조건이 하나 있어요.</w:t>
+        <w:t xml:space="preserve">카스타녜: 낭만적이고 경제적이었죠. 디자이너한테 돈을 안 냈으니까. 받아들일게요, 아가씨. 조건이 하나 있어요.</w:t>
       </w:r>
     </w:p>
     <w:p>
@@ -3208,15 +3208,15 @@
         <w:pStyle w:val="BodyText"/>
       </w:pPr>
       <w:r>
-        <w:t xml:space="preserve">페랑: 절대 비누를 팔지 말 것. 그리고 그쪽 젤 상자를 하나 보내 줘요. 빈 걸로. 내 진열장에 두게.</w:t>
-      </w:r>
-    </w:p>
-    <w:p>
-      <w:pPr>
-        <w:pStyle w:val="BodyText"/>
-      </w:pPr>
-      <w:r>
-        <w:t xml:space="preserve">클레망스: 비누 진열장에 빈 상자 하나. 거래 성사예요, 페랑 부인.</w:t>
+        <w:t xml:space="preserve">카스타녜: 절대 비누를 팔지 말 것. 그리고 그쪽 젤 상자를 하나 보내 줘요. 빈 걸로. 내 진열장에 두게.</w:t>
+      </w:r>
+    </w:p>
+    <w:p>
+      <w:pPr>
+        <w:pStyle w:val="BodyText"/>
+      </w:pPr>
+      <w:r>
+        <w:t xml:space="preserve">클레망스: 비누 진열장에 빈 상자 하나. 거래 성사예요, 카스타녜 부인.</w:t>
       </w:r>
     </w:p>
     <w:bookmarkEnd w:id="34"/>

</xml_diff>